<commit_message>
fix: §5.3.1 Hofstede IDV lookup table 제거
코드북 및 Word 파일에서 Hofstede IDV lookup table 삭제.
culture_cluster 정의는 원래의 간결한 형태로 복원.

Co-Authored-By: Claude Opus 4.6 <noreply@anthropic.com>
</commit_message>
<xml_diff>
--- a/data/04_extraction/AI_Adoption_MASEM_Coding_Manual_v2.docx
+++ b/data/04_extraction/AI_Adoption_MASEM_Coding_Manual_v2.docx
@@ -713,8 +713,8 @@
       <w:r>
         <w:t>1. Introduction and Purpose</w:t>
       </w:r>
-      <w:bookmarkStart w:id="1992" w:name="ch1"/>
-      <w:bookmarkEnd w:id="1992"/>
+      <w:bookmarkStart w:id="1414" w:name="ch1"/>
+      <w:bookmarkEnd w:id="1414"/>
     </w:p>
     <w:p>
       <w:pPr>
@@ -930,8 +930,8 @@
       <w:r>
         <w:t>2. Eligibility Criteria</w:t>
       </w:r>
-      <w:bookmarkStart w:id="5343" w:name="ch2"/>
-      <w:bookmarkEnd w:id="5343"/>
+      <w:bookmarkStart w:id="7756" w:name="ch2"/>
+      <w:bookmarkEnd w:id="7756"/>
     </w:p>
     <w:p>
       <w:pPr>
@@ -2608,8 +2608,8 @@
       <w:r>
         <w:t>3. Coding Workflow Overview</w:t>
       </w:r>
-      <w:bookmarkStart w:id="2259" w:name="ch3"/>
-      <w:bookmarkEnd w:id="2259"/>
+      <w:bookmarkStart w:id="3228" w:name="ch3"/>
+      <w:bookmarkEnd w:id="3228"/>
     </w:p>
     <w:p>
       <w:pPr>
@@ -3852,8 +3852,8 @@
       <w:r>
         <w:t>4. Coder Training Protocol</w:t>
       </w:r>
-      <w:bookmarkStart w:id="9392" w:name="ch4"/>
-      <w:bookmarkEnd w:id="9392"/>
+      <w:bookmarkStart w:id="7940" w:name="ch4"/>
+      <w:bookmarkEnd w:id="7940"/>
     </w:p>
     <w:tbl>
       <w:tblPr>
@@ -4533,8 +4533,8 @@
       <w:r>
         <w:t>5. Study-Level Coding Instructions</w:t>
       </w:r>
-      <w:bookmarkStart w:id="6904" w:name="ch5"/>
-      <w:bookmarkEnd w:id="6904"/>
+      <w:bookmarkStart w:id="6226" w:name="ch5"/>
+      <w:bookmarkEnd w:id="6226"/>
     </w:p>
     <w:p>
       <w:r>
@@ -5949,7 +5949,7 @@
                 <w:rFonts w:ascii="Calibri" w:hAnsi="Calibri"/>
                 <w:sz w:val="20"/>
               </w:rPr>
-              <w:t>Auto-derived from country using Hofstede IDV lookup (§5.3.1)</w:t>
+              <w:t>individualist (IDV≥50) or collectivist (IDV&lt;50) per Hofstede</w:t>
             </w:r>
           </w:p>
         </w:tc>
@@ -6054,1893 +6054,6 @@
       </w:tr>
     </w:tbl>
     <w:p/>
-    <w:p>
-      <w:pPr>
-        <w:pStyle w:val="Heading3"/>
-      </w:pPr>
-      <w:r>
-        <w:t>5.3.1 Culture Cluster Lookup Table (Hofstede IDV)</w:t>
-      </w:r>
-    </w:p>
-    <w:p>
-      <w:r>
-        <w:rPr>
-          <w:rFonts w:ascii="Calibri" w:hAnsi="Calibri"/>
-          <w:sz w:val="22"/>
-        </w:rPr>
-      </w:r>
-      <w:r>
-        <w:rPr>
-          <w:rFonts w:ascii="Consolas" w:hAnsi="Consolas"/>
-          <w:color w:val="C7254E"/>
-          <w:sz w:val="20"/>
-        </w:rPr>
-        <w:t>culture_cluster</w:t>
-      </w:r>
-      <w:r>
-        <w:rPr>
-          <w:rFonts w:ascii="Calibri" w:hAnsi="Calibri"/>
-          <w:sz w:val="22"/>
-        </w:rPr>
-        <w:t xml:space="preserve"> is </w:t>
-      </w:r>
-      <w:r>
-        <w:rPr>
-          <w:rFonts w:ascii="Calibri" w:hAnsi="Calibri"/>
-          <w:b/>
-          <w:sz w:val="22"/>
-        </w:rPr>
-        <w:t>mechanically derived</w:t>
-      </w:r>
-      <w:r>
-        <w:rPr>
-          <w:rFonts w:ascii="Calibri" w:hAnsi="Calibri"/>
-          <w:sz w:val="22"/>
-        </w:rPr>
-        <w:t xml:space="preserve"> from the </w:t>
-      </w:r>
-      <w:r>
-        <w:rPr>
-          <w:rFonts w:ascii="Consolas" w:hAnsi="Consolas"/>
-          <w:color w:val="C7254E"/>
-          <w:sz w:val="20"/>
-        </w:rPr>
-        <w:t>country</w:t>
-      </w:r>
-      <w:r>
-        <w:rPr>
-          <w:rFonts w:ascii="Calibri" w:hAnsi="Calibri"/>
-          <w:sz w:val="22"/>
-        </w:rPr>
-        <w:t xml:space="preserve"> field—coders do NOT need to make a judgment call. After coding </w:t>
-      </w:r>
-      <w:r>
-        <w:rPr>
-          <w:rFonts w:ascii="Consolas" w:hAnsi="Consolas"/>
-          <w:color w:val="C7254E"/>
-          <w:sz w:val="20"/>
-        </w:rPr>
-        <w:t>country</w:t>
-      </w:r>
-      <w:r>
-        <w:rPr>
-          <w:rFonts w:ascii="Calibri" w:hAnsi="Calibri"/>
-          <w:sz w:val="22"/>
-        </w:rPr>
-        <w:t>, look up the table below.</w:t>
-      </w:r>
-    </w:p>
-    <w:tbl>
-      <w:tblPr>
-        <w:tblW w:type="auto" w:w="0"/>
-        <w:jc w:val="center"/>
-        <w:tblLook w:firstColumn="1" w:firstRow="1" w:lastColumn="0" w:lastRow="0" w:noHBand="0" w:noVBand="1" w:val="04A0"/>
-      </w:tblPr>
-      <w:tblGrid>
-        <w:gridCol w:w="9406"/>
-      </w:tblGrid>
-      <w:tr>
-        <w:tc>
-          <w:tcPr>
-            <w:tcW w:type="dxa" w:w="9406"/>
-            <w:shd w:fill="FFF3E0"/>
-          </w:tcPr>
-          <w:p>
-            <w:r>
-              <w:rPr>
-                <w:rFonts w:ascii="Calibri" w:hAnsi="Calibri"/>
-                <w:b/>
-                <w:color w:val="D45B07"/>
-                <w:sz w:val="20"/>
-              </w:rPr>
-              <w:t xml:space="preserve">  TIP: </w:t>
-            </w:r>
-            <w:r>
-              <w:rPr>
-                <w:rFonts w:ascii="Calibri" w:hAnsi="Calibri"/>
-                <w:sz w:val="20"/>
-              </w:rPr>
-              <w:t>Rule: IDV ≥ 50 → individualist  |  IDV &lt; 50 → collectivist</w:t>
-            </w:r>
-          </w:p>
-        </w:tc>
-      </w:tr>
-    </w:tbl>
-    <w:p/>
-    <w:tbl>
-      <w:tblPr>
-        <w:tblW w:type="auto" w:w="0"/>
-        <w:jc w:val="center"/>
-        <w:tblLayout w:type="autofit"/>
-        <w:tblLook w:firstColumn="1" w:firstRow="1" w:lastColumn="0" w:lastRow="0" w:noHBand="0" w:noVBand="1" w:val="04A0"/>
-      </w:tblPr>
-      <w:tblGrid>
-        <w:gridCol w:w="3135"/>
-        <w:gridCol w:w="3135"/>
-        <w:gridCol w:w="3135"/>
-      </w:tblGrid>
-      <w:tr>
-        <w:tc>
-          <w:tcPr>
-            <w:tcW w:type="dxa" w:w="2880"/>
-            <w:shd w:fill="1B3A5C"/>
-          </w:tcPr>
-          <w:p>
-            <w:pPr>
-              <w:jc w:val="center"/>
-            </w:pPr>
-            <w:r/>
-            <w:r>
-              <w:rPr>
-                <w:rFonts w:ascii="Calibri" w:hAnsi="Calibri"/>
-                <w:b/>
-                <w:color w:val="FFFFFF"/>
-                <w:sz w:val="20"/>
-              </w:rPr>
-              <w:t>Country</w:t>
-            </w:r>
-          </w:p>
-        </w:tc>
-        <w:tc>
-          <w:tcPr>
-            <w:tcW w:type="dxa" w:w="1152"/>
-            <w:shd w:fill="1B3A5C"/>
-          </w:tcPr>
-          <w:p>
-            <w:pPr>
-              <w:jc w:val="center"/>
-            </w:pPr>
-            <w:r/>
-            <w:r>
-              <w:rPr>
-                <w:rFonts w:ascii="Calibri" w:hAnsi="Calibri"/>
-                <w:b/>
-                <w:color w:val="FFFFFF"/>
-                <w:sz w:val="20"/>
-              </w:rPr>
-              <w:t>IDV</w:t>
-            </w:r>
-          </w:p>
-        </w:tc>
-        <w:tc>
-          <w:tcPr>
-            <w:tcW w:type="dxa" w:w="2160"/>
-            <w:shd w:fill="1B3A5C"/>
-          </w:tcPr>
-          <w:p>
-            <w:pPr>
-              <w:jc w:val="center"/>
-            </w:pPr>
-            <w:r/>
-            <w:r>
-              <w:rPr>
-                <w:rFonts w:ascii="Calibri" w:hAnsi="Calibri"/>
-                <w:b/>
-                <w:color w:val="FFFFFF"/>
-                <w:sz w:val="20"/>
-              </w:rPr>
-              <w:t>culture_cluster</w:t>
-            </w:r>
-          </w:p>
-        </w:tc>
-      </w:tr>
-      <w:tr>
-        <w:tc>
-          <w:tcPr>
-            <w:tcW w:type="dxa" w:w="2880"/>
-          </w:tcPr>
-          <w:p>
-            <w:pPr>
-              <w:spacing w:before="40" w:after="40"/>
-            </w:pPr>
-            <w:r>
-              <w:rPr>
-                <w:b/>
-              </w:rPr>
-            </w:r>
-            <w:r>
-              <w:rPr>
-                <w:rFonts w:ascii="Calibri" w:hAnsi="Calibri"/>
-                <w:b/>
-                <w:sz w:val="20"/>
-              </w:rPr>
-              <w:t>United States</w:t>
-            </w:r>
-          </w:p>
-        </w:tc>
-        <w:tc>
-          <w:tcPr>
-            <w:tcW w:type="dxa" w:w="1152"/>
-          </w:tcPr>
-          <w:p>
-            <w:pPr>
-              <w:spacing w:before="40" w:after="40"/>
-            </w:pPr>
-            <w:r/>
-            <w:r>
-              <w:rPr>
-                <w:rFonts w:ascii="Calibri" w:hAnsi="Calibri"/>
-                <w:sz w:val="20"/>
-              </w:rPr>
-              <w:t>91</w:t>
-            </w:r>
-          </w:p>
-        </w:tc>
-        <w:tc>
-          <w:tcPr>
-            <w:tcW w:type="dxa" w:w="2160"/>
-          </w:tcPr>
-          <w:p>
-            <w:pPr>
-              <w:spacing w:before="40" w:after="40"/>
-            </w:pPr>
-            <w:r/>
-            <w:r>
-              <w:rPr>
-                <w:rFonts w:ascii="Calibri" w:hAnsi="Calibri"/>
-                <w:sz w:val="20"/>
-              </w:rPr>
-              <w:t>individualist</w:t>
-            </w:r>
-          </w:p>
-        </w:tc>
-      </w:tr>
-      <w:tr>
-        <w:tc>
-          <w:tcPr>
-            <w:tcW w:type="dxa" w:w="2880"/>
-            <w:shd w:fill="F2F7FB"/>
-          </w:tcPr>
-          <w:p>
-            <w:pPr>
-              <w:spacing w:before="40" w:after="40"/>
-            </w:pPr>
-            <w:r>
-              <w:rPr>
-                <w:b/>
-              </w:rPr>
-            </w:r>
-            <w:r>
-              <w:rPr>
-                <w:rFonts w:ascii="Calibri" w:hAnsi="Calibri"/>
-                <w:b/>
-                <w:sz w:val="20"/>
-              </w:rPr>
-              <w:t>Australia</w:t>
-            </w:r>
-          </w:p>
-        </w:tc>
-        <w:tc>
-          <w:tcPr>
-            <w:tcW w:type="dxa" w:w="1152"/>
-            <w:shd w:fill="F2F7FB"/>
-          </w:tcPr>
-          <w:p>
-            <w:pPr>
-              <w:spacing w:before="40" w:after="40"/>
-            </w:pPr>
-            <w:r/>
-            <w:r>
-              <w:rPr>
-                <w:rFonts w:ascii="Calibri" w:hAnsi="Calibri"/>
-                <w:sz w:val="20"/>
-              </w:rPr>
-              <w:t>90</w:t>
-            </w:r>
-          </w:p>
-        </w:tc>
-        <w:tc>
-          <w:tcPr>
-            <w:tcW w:type="dxa" w:w="2160"/>
-            <w:shd w:fill="F2F7FB"/>
-          </w:tcPr>
-          <w:p>
-            <w:pPr>
-              <w:spacing w:before="40" w:after="40"/>
-            </w:pPr>
-            <w:r/>
-            <w:r>
-              <w:rPr>
-                <w:rFonts w:ascii="Calibri" w:hAnsi="Calibri"/>
-                <w:sz w:val="20"/>
-              </w:rPr>
-              <w:t>individualist</w:t>
-            </w:r>
-          </w:p>
-        </w:tc>
-      </w:tr>
-      <w:tr>
-        <w:tc>
-          <w:tcPr>
-            <w:tcW w:type="dxa" w:w="2880"/>
-          </w:tcPr>
-          <w:p>
-            <w:pPr>
-              <w:spacing w:before="40" w:after="40"/>
-            </w:pPr>
-            <w:r>
-              <w:rPr>
-                <w:b/>
-              </w:rPr>
-            </w:r>
-            <w:r>
-              <w:rPr>
-                <w:rFonts w:ascii="Calibri" w:hAnsi="Calibri"/>
-                <w:b/>
-                <w:sz w:val="20"/>
-              </w:rPr>
-              <w:t>United Kingdom</w:t>
-            </w:r>
-          </w:p>
-        </w:tc>
-        <w:tc>
-          <w:tcPr>
-            <w:tcW w:type="dxa" w:w="1152"/>
-          </w:tcPr>
-          <w:p>
-            <w:pPr>
-              <w:spacing w:before="40" w:after="40"/>
-            </w:pPr>
-            <w:r/>
-            <w:r>
-              <w:rPr>
-                <w:rFonts w:ascii="Calibri" w:hAnsi="Calibri"/>
-                <w:sz w:val="20"/>
-              </w:rPr>
-              <w:t>89</w:t>
-            </w:r>
-          </w:p>
-        </w:tc>
-        <w:tc>
-          <w:tcPr>
-            <w:tcW w:type="dxa" w:w="2160"/>
-          </w:tcPr>
-          <w:p>
-            <w:pPr>
-              <w:spacing w:before="40" w:after="40"/>
-            </w:pPr>
-            <w:r/>
-            <w:r>
-              <w:rPr>
-                <w:rFonts w:ascii="Calibri" w:hAnsi="Calibri"/>
-                <w:sz w:val="20"/>
-              </w:rPr>
-              <w:t>individualist</w:t>
-            </w:r>
-          </w:p>
-        </w:tc>
-      </w:tr>
-      <w:tr>
-        <w:tc>
-          <w:tcPr>
-            <w:tcW w:type="dxa" w:w="2880"/>
-            <w:shd w:fill="F2F7FB"/>
-          </w:tcPr>
-          <w:p>
-            <w:pPr>
-              <w:spacing w:before="40" w:after="40"/>
-            </w:pPr>
-            <w:r>
-              <w:rPr>
-                <w:b/>
-              </w:rPr>
-            </w:r>
-            <w:r>
-              <w:rPr>
-                <w:rFonts w:ascii="Calibri" w:hAnsi="Calibri"/>
-                <w:b/>
-                <w:sz w:val="20"/>
-              </w:rPr>
-              <w:t>Canada</w:t>
-            </w:r>
-          </w:p>
-        </w:tc>
-        <w:tc>
-          <w:tcPr>
-            <w:tcW w:type="dxa" w:w="1152"/>
-            <w:shd w:fill="F2F7FB"/>
-          </w:tcPr>
-          <w:p>
-            <w:pPr>
-              <w:spacing w:before="40" w:after="40"/>
-            </w:pPr>
-            <w:r/>
-            <w:r>
-              <w:rPr>
-                <w:rFonts w:ascii="Calibri" w:hAnsi="Calibri"/>
-                <w:sz w:val="20"/>
-              </w:rPr>
-              <w:t>80</w:t>
-            </w:r>
-          </w:p>
-        </w:tc>
-        <w:tc>
-          <w:tcPr>
-            <w:tcW w:type="dxa" w:w="2160"/>
-            <w:shd w:fill="F2F7FB"/>
-          </w:tcPr>
-          <w:p>
-            <w:pPr>
-              <w:spacing w:before="40" w:after="40"/>
-            </w:pPr>
-            <w:r/>
-            <w:r>
-              <w:rPr>
-                <w:rFonts w:ascii="Calibri" w:hAnsi="Calibri"/>
-                <w:sz w:val="20"/>
-              </w:rPr>
-              <w:t>individualist</w:t>
-            </w:r>
-          </w:p>
-        </w:tc>
-      </w:tr>
-      <w:tr>
-        <w:tc>
-          <w:tcPr>
-            <w:tcW w:type="dxa" w:w="2880"/>
-          </w:tcPr>
-          <w:p>
-            <w:pPr>
-              <w:spacing w:before="40" w:after="40"/>
-            </w:pPr>
-            <w:r>
-              <w:rPr>
-                <w:b/>
-              </w:rPr>
-            </w:r>
-            <w:r>
-              <w:rPr>
-                <w:rFonts w:ascii="Calibri" w:hAnsi="Calibri"/>
-                <w:b/>
-                <w:sz w:val="20"/>
-              </w:rPr>
-              <w:t>Netherlands</w:t>
-            </w:r>
-          </w:p>
-        </w:tc>
-        <w:tc>
-          <w:tcPr>
-            <w:tcW w:type="dxa" w:w="1152"/>
-          </w:tcPr>
-          <w:p>
-            <w:pPr>
-              <w:spacing w:before="40" w:after="40"/>
-            </w:pPr>
-            <w:r/>
-            <w:r>
-              <w:rPr>
-                <w:rFonts w:ascii="Calibri" w:hAnsi="Calibri"/>
-                <w:sz w:val="20"/>
-              </w:rPr>
-              <w:t>80</w:t>
-            </w:r>
-          </w:p>
-        </w:tc>
-        <w:tc>
-          <w:tcPr>
-            <w:tcW w:type="dxa" w:w="2160"/>
-          </w:tcPr>
-          <w:p>
-            <w:pPr>
-              <w:spacing w:before="40" w:after="40"/>
-            </w:pPr>
-            <w:r/>
-            <w:r>
-              <w:rPr>
-                <w:rFonts w:ascii="Calibri" w:hAnsi="Calibri"/>
-                <w:sz w:val="20"/>
-              </w:rPr>
-              <w:t>individualist</w:t>
-            </w:r>
-          </w:p>
-        </w:tc>
-      </w:tr>
-      <w:tr>
-        <w:tc>
-          <w:tcPr>
-            <w:tcW w:type="dxa" w:w="2880"/>
-            <w:shd w:fill="F2F7FB"/>
-          </w:tcPr>
-          <w:p>
-            <w:pPr>
-              <w:spacing w:before="40" w:after="40"/>
-            </w:pPr>
-            <w:r>
-              <w:rPr>
-                <w:b/>
-              </w:rPr>
-            </w:r>
-            <w:r>
-              <w:rPr>
-                <w:rFonts w:ascii="Calibri" w:hAnsi="Calibri"/>
-                <w:b/>
-                <w:sz w:val="20"/>
-              </w:rPr>
-              <w:t>Germany</w:t>
-            </w:r>
-          </w:p>
-        </w:tc>
-        <w:tc>
-          <w:tcPr>
-            <w:tcW w:type="dxa" w:w="1152"/>
-            <w:shd w:fill="F2F7FB"/>
-          </w:tcPr>
-          <w:p>
-            <w:pPr>
-              <w:spacing w:before="40" w:after="40"/>
-            </w:pPr>
-            <w:r/>
-            <w:r>
-              <w:rPr>
-                <w:rFonts w:ascii="Calibri" w:hAnsi="Calibri"/>
-                <w:sz w:val="20"/>
-              </w:rPr>
-              <w:t>67</w:t>
-            </w:r>
-          </w:p>
-        </w:tc>
-        <w:tc>
-          <w:tcPr>
-            <w:tcW w:type="dxa" w:w="2160"/>
-            <w:shd w:fill="F2F7FB"/>
-          </w:tcPr>
-          <w:p>
-            <w:pPr>
-              <w:spacing w:before="40" w:after="40"/>
-            </w:pPr>
-            <w:r/>
-            <w:r>
-              <w:rPr>
-                <w:rFonts w:ascii="Calibri" w:hAnsi="Calibri"/>
-                <w:sz w:val="20"/>
-              </w:rPr>
-              <w:t>individualist</w:t>
-            </w:r>
-          </w:p>
-        </w:tc>
-      </w:tr>
-      <w:tr>
-        <w:tc>
-          <w:tcPr>
-            <w:tcW w:type="dxa" w:w="2880"/>
-          </w:tcPr>
-          <w:p>
-            <w:pPr>
-              <w:spacing w:before="40" w:after="40"/>
-            </w:pPr>
-            <w:r>
-              <w:rPr>
-                <w:b/>
-              </w:rPr>
-            </w:r>
-            <w:r>
-              <w:rPr>
-                <w:rFonts w:ascii="Calibri" w:hAnsi="Calibri"/>
-                <w:b/>
-                <w:sz w:val="20"/>
-              </w:rPr>
-              <w:t>Finland</w:t>
-            </w:r>
-          </w:p>
-        </w:tc>
-        <w:tc>
-          <w:tcPr>
-            <w:tcW w:type="dxa" w:w="1152"/>
-          </w:tcPr>
-          <w:p>
-            <w:pPr>
-              <w:spacing w:before="40" w:after="40"/>
-            </w:pPr>
-            <w:r/>
-            <w:r>
-              <w:rPr>
-                <w:rFonts w:ascii="Calibri" w:hAnsi="Calibri"/>
-                <w:sz w:val="20"/>
-              </w:rPr>
-              <w:t>63</w:t>
-            </w:r>
-          </w:p>
-        </w:tc>
-        <w:tc>
-          <w:tcPr>
-            <w:tcW w:type="dxa" w:w="2160"/>
-          </w:tcPr>
-          <w:p>
-            <w:pPr>
-              <w:spacing w:before="40" w:after="40"/>
-            </w:pPr>
-            <w:r/>
-            <w:r>
-              <w:rPr>
-                <w:rFonts w:ascii="Calibri" w:hAnsi="Calibri"/>
-                <w:sz w:val="20"/>
-              </w:rPr>
-              <w:t>individualist</w:t>
-            </w:r>
-          </w:p>
-        </w:tc>
-      </w:tr>
-      <w:tr>
-        <w:tc>
-          <w:tcPr>
-            <w:tcW w:type="dxa" w:w="2880"/>
-            <w:shd w:fill="F2F7FB"/>
-          </w:tcPr>
-          <w:p>
-            <w:pPr>
-              <w:spacing w:before="40" w:after="40"/>
-            </w:pPr>
-            <w:r>
-              <w:rPr>
-                <w:b/>
-              </w:rPr>
-            </w:r>
-            <w:r>
-              <w:rPr>
-                <w:rFonts w:ascii="Calibri" w:hAnsi="Calibri"/>
-                <w:b/>
-                <w:sz w:val="20"/>
-              </w:rPr>
-              <w:t>Spain</w:t>
-            </w:r>
-          </w:p>
-        </w:tc>
-        <w:tc>
-          <w:tcPr>
-            <w:tcW w:type="dxa" w:w="1152"/>
-            <w:shd w:fill="F2F7FB"/>
-          </w:tcPr>
-          <w:p>
-            <w:pPr>
-              <w:spacing w:before="40" w:after="40"/>
-            </w:pPr>
-            <w:r/>
-            <w:r>
-              <w:rPr>
-                <w:rFonts w:ascii="Calibri" w:hAnsi="Calibri"/>
-                <w:sz w:val="20"/>
-              </w:rPr>
-              <w:t>51</w:t>
-            </w:r>
-          </w:p>
-        </w:tc>
-        <w:tc>
-          <w:tcPr>
-            <w:tcW w:type="dxa" w:w="2160"/>
-            <w:shd w:fill="F2F7FB"/>
-          </w:tcPr>
-          <w:p>
-            <w:pPr>
-              <w:spacing w:before="40" w:after="40"/>
-            </w:pPr>
-            <w:r/>
-            <w:r>
-              <w:rPr>
-                <w:rFonts w:ascii="Calibri" w:hAnsi="Calibri"/>
-                <w:sz w:val="20"/>
-              </w:rPr>
-              <w:t>individualist</w:t>
-            </w:r>
-          </w:p>
-        </w:tc>
-      </w:tr>
-      <w:tr>
-        <w:tc>
-          <w:tcPr>
-            <w:tcW w:type="dxa" w:w="2880"/>
-          </w:tcPr>
-          <w:p>
-            <w:pPr>
-              <w:spacing w:before="40" w:after="40"/>
-            </w:pPr>
-            <w:r>
-              <w:rPr>
-                <w:b/>
-              </w:rPr>
-            </w:r>
-            <w:r>
-              <w:rPr>
-                <w:rFonts w:ascii="Calibri" w:hAnsi="Calibri"/>
-                <w:b/>
-                <w:sz w:val="20"/>
-              </w:rPr>
-              <w:t>India</w:t>
-            </w:r>
-          </w:p>
-        </w:tc>
-        <w:tc>
-          <w:tcPr>
-            <w:tcW w:type="dxa" w:w="1152"/>
-          </w:tcPr>
-          <w:p>
-            <w:pPr>
-              <w:spacing w:before="40" w:after="40"/>
-            </w:pPr>
-            <w:r/>
-            <w:r>
-              <w:rPr>
-                <w:rFonts w:ascii="Calibri" w:hAnsi="Calibri"/>
-                <w:sz w:val="20"/>
-              </w:rPr>
-              <w:t>48</w:t>
-            </w:r>
-          </w:p>
-        </w:tc>
-        <w:tc>
-          <w:tcPr>
-            <w:tcW w:type="dxa" w:w="2160"/>
-          </w:tcPr>
-          <w:p>
-            <w:pPr>
-              <w:spacing w:before="40" w:after="40"/>
-            </w:pPr>
-            <w:r/>
-            <w:r>
-              <w:rPr>
-                <w:rFonts w:ascii="Calibri" w:hAnsi="Calibri"/>
-                <w:sz w:val="20"/>
-              </w:rPr>
-              <w:t>collectivist</w:t>
-            </w:r>
-          </w:p>
-        </w:tc>
-      </w:tr>
-      <w:tr>
-        <w:tc>
-          <w:tcPr>
-            <w:tcW w:type="dxa" w:w="2880"/>
-            <w:shd w:fill="F2F7FB"/>
-          </w:tcPr>
-          <w:p>
-            <w:pPr>
-              <w:spacing w:before="40" w:after="40"/>
-            </w:pPr>
-            <w:r>
-              <w:rPr>
-                <w:b/>
-              </w:rPr>
-            </w:r>
-            <w:r>
-              <w:rPr>
-                <w:rFonts w:ascii="Calibri" w:hAnsi="Calibri"/>
-                <w:b/>
-                <w:sz w:val="20"/>
-              </w:rPr>
-              <w:t>Japan</w:t>
-            </w:r>
-          </w:p>
-        </w:tc>
-        <w:tc>
-          <w:tcPr>
-            <w:tcW w:type="dxa" w:w="1152"/>
-            <w:shd w:fill="F2F7FB"/>
-          </w:tcPr>
-          <w:p>
-            <w:pPr>
-              <w:spacing w:before="40" w:after="40"/>
-            </w:pPr>
-            <w:r/>
-            <w:r>
-              <w:rPr>
-                <w:rFonts w:ascii="Calibri" w:hAnsi="Calibri"/>
-                <w:sz w:val="20"/>
-              </w:rPr>
-              <w:t>46</w:t>
-            </w:r>
-          </w:p>
-        </w:tc>
-        <w:tc>
-          <w:tcPr>
-            <w:tcW w:type="dxa" w:w="2160"/>
-            <w:shd w:fill="F2F7FB"/>
-          </w:tcPr>
-          <w:p>
-            <w:pPr>
-              <w:spacing w:before="40" w:after="40"/>
-            </w:pPr>
-            <w:r/>
-            <w:r>
-              <w:rPr>
-                <w:rFonts w:ascii="Calibri" w:hAnsi="Calibri"/>
-                <w:sz w:val="20"/>
-              </w:rPr>
-              <w:t>collectivist</w:t>
-            </w:r>
-          </w:p>
-        </w:tc>
-      </w:tr>
-      <w:tr>
-        <w:tc>
-          <w:tcPr>
-            <w:tcW w:type="dxa" w:w="2880"/>
-          </w:tcPr>
-          <w:p>
-            <w:pPr>
-              <w:spacing w:before="40" w:after="40"/>
-            </w:pPr>
-            <w:r>
-              <w:rPr>
-                <w:b/>
-              </w:rPr>
-            </w:r>
-            <w:r>
-              <w:rPr>
-                <w:rFonts w:ascii="Calibri" w:hAnsi="Calibri"/>
-                <w:b/>
-                <w:sz w:val="20"/>
-              </w:rPr>
-              <w:t>Iran</w:t>
-            </w:r>
-          </w:p>
-        </w:tc>
-        <w:tc>
-          <w:tcPr>
-            <w:tcW w:type="dxa" w:w="1152"/>
-          </w:tcPr>
-          <w:p>
-            <w:pPr>
-              <w:spacing w:before="40" w:after="40"/>
-            </w:pPr>
-            <w:r/>
-            <w:r>
-              <w:rPr>
-                <w:rFonts w:ascii="Calibri" w:hAnsi="Calibri"/>
-                <w:sz w:val="20"/>
-              </w:rPr>
-              <w:t>41</w:t>
-            </w:r>
-          </w:p>
-        </w:tc>
-        <w:tc>
-          <w:tcPr>
-            <w:tcW w:type="dxa" w:w="2160"/>
-          </w:tcPr>
-          <w:p>
-            <w:pPr>
-              <w:spacing w:before="40" w:after="40"/>
-            </w:pPr>
-            <w:r/>
-            <w:r>
-              <w:rPr>
-                <w:rFonts w:ascii="Calibri" w:hAnsi="Calibri"/>
-                <w:sz w:val="20"/>
-              </w:rPr>
-              <w:t>collectivist</w:t>
-            </w:r>
-          </w:p>
-        </w:tc>
-      </w:tr>
-      <w:tr>
-        <w:tc>
-          <w:tcPr>
-            <w:tcW w:type="dxa" w:w="2880"/>
-            <w:shd w:fill="F2F7FB"/>
-          </w:tcPr>
-          <w:p>
-            <w:pPr>
-              <w:spacing w:before="40" w:after="40"/>
-            </w:pPr>
-            <w:r>
-              <w:rPr>
-                <w:b/>
-              </w:rPr>
-            </w:r>
-            <w:r>
-              <w:rPr>
-                <w:rFonts w:ascii="Calibri" w:hAnsi="Calibri"/>
-                <w:b/>
-                <w:sz w:val="20"/>
-              </w:rPr>
-              <w:t>Turkey</w:t>
-            </w:r>
-          </w:p>
-        </w:tc>
-        <w:tc>
-          <w:tcPr>
-            <w:tcW w:type="dxa" w:w="1152"/>
-            <w:shd w:fill="F2F7FB"/>
-          </w:tcPr>
-          <w:p>
-            <w:pPr>
-              <w:spacing w:before="40" w:after="40"/>
-            </w:pPr>
-            <w:r/>
-            <w:r>
-              <w:rPr>
-                <w:rFonts w:ascii="Calibri" w:hAnsi="Calibri"/>
-                <w:sz w:val="20"/>
-              </w:rPr>
-              <w:t>37</w:t>
-            </w:r>
-          </w:p>
-        </w:tc>
-        <w:tc>
-          <w:tcPr>
-            <w:tcW w:type="dxa" w:w="2160"/>
-            <w:shd w:fill="F2F7FB"/>
-          </w:tcPr>
-          <w:p>
-            <w:pPr>
-              <w:spacing w:before="40" w:after="40"/>
-            </w:pPr>
-            <w:r/>
-            <w:r>
-              <w:rPr>
-                <w:rFonts w:ascii="Calibri" w:hAnsi="Calibri"/>
-                <w:sz w:val="20"/>
-              </w:rPr>
-              <w:t>collectivist</w:t>
-            </w:r>
-          </w:p>
-        </w:tc>
-      </w:tr>
-      <w:tr>
-        <w:tc>
-          <w:tcPr>
-            <w:tcW w:type="dxa" w:w="2880"/>
-          </w:tcPr>
-          <w:p>
-            <w:pPr>
-              <w:spacing w:before="40" w:after="40"/>
-            </w:pPr>
-            <w:r>
-              <w:rPr>
-                <w:b/>
-              </w:rPr>
-            </w:r>
-            <w:r>
-              <w:rPr>
-                <w:rFonts w:ascii="Calibri" w:hAnsi="Calibri"/>
-                <w:b/>
-                <w:sz w:val="20"/>
-              </w:rPr>
-              <w:t>Brazil</w:t>
-            </w:r>
-          </w:p>
-        </w:tc>
-        <w:tc>
-          <w:tcPr>
-            <w:tcW w:type="dxa" w:w="1152"/>
-          </w:tcPr>
-          <w:p>
-            <w:pPr>
-              <w:spacing w:before="40" w:after="40"/>
-            </w:pPr>
-            <w:r/>
-            <w:r>
-              <w:rPr>
-                <w:rFonts w:ascii="Calibri" w:hAnsi="Calibri"/>
-                <w:sz w:val="20"/>
-              </w:rPr>
-              <w:t>38</w:t>
-            </w:r>
-          </w:p>
-        </w:tc>
-        <w:tc>
-          <w:tcPr>
-            <w:tcW w:type="dxa" w:w="2160"/>
-          </w:tcPr>
-          <w:p>
-            <w:pPr>
-              <w:spacing w:before="40" w:after="40"/>
-            </w:pPr>
-            <w:r/>
-            <w:r>
-              <w:rPr>
-                <w:rFonts w:ascii="Calibri" w:hAnsi="Calibri"/>
-                <w:sz w:val="20"/>
-              </w:rPr>
-              <w:t>collectivist</w:t>
-            </w:r>
-          </w:p>
-        </w:tc>
-      </w:tr>
-      <w:tr>
-        <w:tc>
-          <w:tcPr>
-            <w:tcW w:type="dxa" w:w="2880"/>
-            <w:shd w:fill="F2F7FB"/>
-          </w:tcPr>
-          <w:p>
-            <w:pPr>
-              <w:spacing w:before="40" w:after="40"/>
-            </w:pPr>
-            <w:r>
-              <w:rPr>
-                <w:b/>
-              </w:rPr>
-            </w:r>
-            <w:r>
-              <w:rPr>
-                <w:rFonts w:ascii="Calibri" w:hAnsi="Calibri"/>
-                <w:b/>
-                <w:sz w:val="20"/>
-              </w:rPr>
-              <w:t>Philippines</w:t>
-            </w:r>
-          </w:p>
-        </w:tc>
-        <w:tc>
-          <w:tcPr>
-            <w:tcW w:type="dxa" w:w="1152"/>
-            <w:shd w:fill="F2F7FB"/>
-          </w:tcPr>
-          <w:p>
-            <w:pPr>
-              <w:spacing w:before="40" w:after="40"/>
-            </w:pPr>
-            <w:r/>
-            <w:r>
-              <w:rPr>
-                <w:rFonts w:ascii="Calibri" w:hAnsi="Calibri"/>
-                <w:sz w:val="20"/>
-              </w:rPr>
-              <w:t>32</w:t>
-            </w:r>
-          </w:p>
-        </w:tc>
-        <w:tc>
-          <w:tcPr>
-            <w:tcW w:type="dxa" w:w="2160"/>
-            <w:shd w:fill="F2F7FB"/>
-          </w:tcPr>
-          <w:p>
-            <w:pPr>
-              <w:spacing w:before="40" w:after="40"/>
-            </w:pPr>
-            <w:r/>
-            <w:r>
-              <w:rPr>
-                <w:rFonts w:ascii="Calibri" w:hAnsi="Calibri"/>
-                <w:sz w:val="20"/>
-              </w:rPr>
-              <w:t>collectivist</w:t>
-            </w:r>
-          </w:p>
-        </w:tc>
-      </w:tr>
-      <w:tr>
-        <w:tc>
-          <w:tcPr>
-            <w:tcW w:type="dxa" w:w="2880"/>
-          </w:tcPr>
-          <w:p>
-            <w:pPr>
-              <w:spacing w:before="40" w:after="40"/>
-            </w:pPr>
-            <w:r>
-              <w:rPr>
-                <w:b/>
-              </w:rPr>
-            </w:r>
-            <w:r>
-              <w:rPr>
-                <w:rFonts w:ascii="Calibri" w:hAnsi="Calibri"/>
-                <w:b/>
-                <w:sz w:val="20"/>
-              </w:rPr>
-              <w:t>Jordan</w:t>
-            </w:r>
-          </w:p>
-        </w:tc>
-        <w:tc>
-          <w:tcPr>
-            <w:tcW w:type="dxa" w:w="1152"/>
-          </w:tcPr>
-          <w:p>
-            <w:pPr>
-              <w:spacing w:before="40" w:after="40"/>
-            </w:pPr>
-            <w:r/>
-            <w:r>
-              <w:rPr>
-                <w:rFonts w:ascii="Calibri" w:hAnsi="Calibri"/>
-                <w:sz w:val="20"/>
-              </w:rPr>
-              <w:t>30</w:t>
-            </w:r>
-          </w:p>
-        </w:tc>
-        <w:tc>
-          <w:tcPr>
-            <w:tcW w:type="dxa" w:w="2160"/>
-          </w:tcPr>
-          <w:p>
-            <w:pPr>
-              <w:spacing w:before="40" w:after="40"/>
-            </w:pPr>
-            <w:r/>
-            <w:r>
-              <w:rPr>
-                <w:rFonts w:ascii="Calibri" w:hAnsi="Calibri"/>
-                <w:sz w:val="20"/>
-              </w:rPr>
-              <w:t>collectivist</w:t>
-            </w:r>
-          </w:p>
-        </w:tc>
-      </w:tr>
-      <w:tr>
-        <w:tc>
-          <w:tcPr>
-            <w:tcW w:type="dxa" w:w="2880"/>
-            <w:shd w:fill="F2F7FB"/>
-          </w:tcPr>
-          <w:p>
-            <w:pPr>
-              <w:spacing w:before="40" w:after="40"/>
-            </w:pPr>
-            <w:r>
-              <w:rPr>
-                <w:b/>
-              </w:rPr>
-            </w:r>
-            <w:r>
-              <w:rPr>
-                <w:rFonts w:ascii="Calibri" w:hAnsi="Calibri"/>
-                <w:b/>
-                <w:sz w:val="20"/>
-              </w:rPr>
-              <w:t>Mexico</w:t>
-            </w:r>
-          </w:p>
-        </w:tc>
-        <w:tc>
-          <w:tcPr>
-            <w:tcW w:type="dxa" w:w="1152"/>
-            <w:shd w:fill="F2F7FB"/>
-          </w:tcPr>
-          <w:p>
-            <w:pPr>
-              <w:spacing w:before="40" w:after="40"/>
-            </w:pPr>
-            <w:r/>
-            <w:r>
-              <w:rPr>
-                <w:rFonts w:ascii="Calibri" w:hAnsi="Calibri"/>
-                <w:sz w:val="20"/>
-              </w:rPr>
-              <w:t>30</w:t>
-            </w:r>
-          </w:p>
-        </w:tc>
-        <w:tc>
-          <w:tcPr>
-            <w:tcW w:type="dxa" w:w="2160"/>
-            <w:shd w:fill="F2F7FB"/>
-          </w:tcPr>
-          <w:p>
-            <w:pPr>
-              <w:spacing w:before="40" w:after="40"/>
-            </w:pPr>
-            <w:r/>
-            <w:r>
-              <w:rPr>
-                <w:rFonts w:ascii="Calibri" w:hAnsi="Calibri"/>
-                <w:sz w:val="20"/>
-              </w:rPr>
-              <w:t>collectivist</w:t>
-            </w:r>
-          </w:p>
-        </w:tc>
-      </w:tr>
-      <w:tr>
-        <w:tc>
-          <w:tcPr>
-            <w:tcW w:type="dxa" w:w="2880"/>
-          </w:tcPr>
-          <w:p>
-            <w:pPr>
-              <w:spacing w:before="40" w:after="40"/>
-            </w:pPr>
-            <w:r>
-              <w:rPr>
-                <w:b/>
-              </w:rPr>
-            </w:r>
-            <w:r>
-              <w:rPr>
-                <w:rFonts w:ascii="Calibri" w:hAnsi="Calibri"/>
-                <w:b/>
-                <w:sz w:val="20"/>
-              </w:rPr>
-              <w:t>Nigeria</w:t>
-            </w:r>
-          </w:p>
-        </w:tc>
-        <w:tc>
-          <w:tcPr>
-            <w:tcW w:type="dxa" w:w="1152"/>
-          </w:tcPr>
-          <w:p>
-            <w:pPr>
-              <w:spacing w:before="40" w:after="40"/>
-            </w:pPr>
-            <w:r/>
-            <w:r>
-              <w:rPr>
-                <w:rFonts w:ascii="Calibri" w:hAnsi="Calibri"/>
-                <w:sz w:val="20"/>
-              </w:rPr>
-              <w:t>30</w:t>
-            </w:r>
-          </w:p>
-        </w:tc>
-        <w:tc>
-          <w:tcPr>
-            <w:tcW w:type="dxa" w:w="2160"/>
-          </w:tcPr>
-          <w:p>
-            <w:pPr>
-              <w:spacing w:before="40" w:after="40"/>
-            </w:pPr>
-            <w:r/>
-            <w:r>
-              <w:rPr>
-                <w:rFonts w:ascii="Calibri" w:hAnsi="Calibri"/>
-                <w:sz w:val="20"/>
-              </w:rPr>
-              <w:t>collectivist</w:t>
-            </w:r>
-          </w:p>
-        </w:tc>
-      </w:tr>
-      <w:tr>
-        <w:tc>
-          <w:tcPr>
-            <w:tcW w:type="dxa" w:w="2880"/>
-            <w:shd w:fill="F2F7FB"/>
-          </w:tcPr>
-          <w:p>
-            <w:pPr>
-              <w:spacing w:before="40" w:after="40"/>
-            </w:pPr>
-            <w:r>
-              <w:rPr>
-                <w:b/>
-              </w:rPr>
-            </w:r>
-            <w:r>
-              <w:rPr>
-                <w:rFonts w:ascii="Calibri" w:hAnsi="Calibri"/>
-                <w:b/>
-                <w:sz w:val="20"/>
-              </w:rPr>
-              <w:t>Malaysia</w:t>
-            </w:r>
-          </w:p>
-        </w:tc>
-        <w:tc>
-          <w:tcPr>
-            <w:tcW w:type="dxa" w:w="1152"/>
-            <w:shd w:fill="F2F7FB"/>
-          </w:tcPr>
-          <w:p>
-            <w:pPr>
-              <w:spacing w:before="40" w:after="40"/>
-            </w:pPr>
-            <w:r/>
-            <w:r>
-              <w:rPr>
-                <w:rFonts w:ascii="Calibri" w:hAnsi="Calibri"/>
-                <w:sz w:val="20"/>
-              </w:rPr>
-              <w:t>26</w:t>
-            </w:r>
-          </w:p>
-        </w:tc>
-        <w:tc>
-          <w:tcPr>
-            <w:tcW w:type="dxa" w:w="2160"/>
-            <w:shd w:fill="F2F7FB"/>
-          </w:tcPr>
-          <w:p>
-            <w:pPr>
-              <w:spacing w:before="40" w:after="40"/>
-            </w:pPr>
-            <w:r/>
-            <w:r>
-              <w:rPr>
-                <w:rFonts w:ascii="Calibri" w:hAnsi="Calibri"/>
-                <w:sz w:val="20"/>
-              </w:rPr>
-              <w:t>collectivist</w:t>
-            </w:r>
-          </w:p>
-        </w:tc>
-      </w:tr>
-      <w:tr>
-        <w:tc>
-          <w:tcPr>
-            <w:tcW w:type="dxa" w:w="2880"/>
-          </w:tcPr>
-          <w:p>
-            <w:pPr>
-              <w:spacing w:before="40" w:after="40"/>
-            </w:pPr>
-            <w:r>
-              <w:rPr>
-                <w:b/>
-              </w:rPr>
-            </w:r>
-            <w:r>
-              <w:rPr>
-                <w:rFonts w:ascii="Calibri" w:hAnsi="Calibri"/>
-                <w:b/>
-                <w:sz w:val="20"/>
-              </w:rPr>
-              <w:t>Saudi Arabia</w:t>
-            </w:r>
-          </w:p>
-        </w:tc>
-        <w:tc>
-          <w:tcPr>
-            <w:tcW w:type="dxa" w:w="1152"/>
-          </w:tcPr>
-          <w:p>
-            <w:pPr>
-              <w:spacing w:before="40" w:after="40"/>
-            </w:pPr>
-            <w:r/>
-            <w:r>
-              <w:rPr>
-                <w:rFonts w:ascii="Calibri" w:hAnsi="Calibri"/>
-                <w:sz w:val="20"/>
-              </w:rPr>
-              <w:t>25</w:t>
-            </w:r>
-          </w:p>
-        </w:tc>
-        <w:tc>
-          <w:tcPr>
-            <w:tcW w:type="dxa" w:w="2160"/>
-          </w:tcPr>
-          <w:p>
-            <w:pPr>
-              <w:spacing w:before="40" w:after="40"/>
-            </w:pPr>
-            <w:r/>
-            <w:r>
-              <w:rPr>
-                <w:rFonts w:ascii="Calibri" w:hAnsi="Calibri"/>
-                <w:sz w:val="20"/>
-              </w:rPr>
-              <w:t>collectivist</w:t>
-            </w:r>
-          </w:p>
-        </w:tc>
-      </w:tr>
-      <w:tr>
-        <w:tc>
-          <w:tcPr>
-            <w:tcW w:type="dxa" w:w="2880"/>
-            <w:shd w:fill="F2F7FB"/>
-          </w:tcPr>
-          <w:p>
-            <w:pPr>
-              <w:spacing w:before="40" w:after="40"/>
-            </w:pPr>
-            <w:r>
-              <w:rPr>
-                <w:b/>
-              </w:rPr>
-            </w:r>
-            <w:r>
-              <w:rPr>
-                <w:rFonts w:ascii="Calibri" w:hAnsi="Calibri"/>
-                <w:b/>
-                <w:sz w:val="20"/>
-              </w:rPr>
-              <w:t>UAE</w:t>
-            </w:r>
-          </w:p>
-        </w:tc>
-        <w:tc>
-          <w:tcPr>
-            <w:tcW w:type="dxa" w:w="1152"/>
-            <w:shd w:fill="F2F7FB"/>
-          </w:tcPr>
-          <w:p>
-            <w:pPr>
-              <w:spacing w:before="40" w:after="40"/>
-            </w:pPr>
-            <w:r/>
-            <w:r>
-              <w:rPr>
-                <w:rFonts w:ascii="Calibri" w:hAnsi="Calibri"/>
-                <w:sz w:val="20"/>
-              </w:rPr>
-              <w:t>25</w:t>
-            </w:r>
-          </w:p>
-        </w:tc>
-        <w:tc>
-          <w:tcPr>
-            <w:tcW w:type="dxa" w:w="2160"/>
-            <w:shd w:fill="F2F7FB"/>
-          </w:tcPr>
-          <w:p>
-            <w:pPr>
-              <w:spacing w:before="40" w:after="40"/>
-            </w:pPr>
-            <w:r/>
-            <w:r>
-              <w:rPr>
-                <w:rFonts w:ascii="Calibri" w:hAnsi="Calibri"/>
-                <w:sz w:val="20"/>
-              </w:rPr>
-              <w:t>collectivist</w:t>
-            </w:r>
-          </w:p>
-        </w:tc>
-      </w:tr>
-      <w:tr>
-        <w:tc>
-          <w:tcPr>
-            <w:tcW w:type="dxa" w:w="2880"/>
-          </w:tcPr>
-          <w:p>
-            <w:pPr>
-              <w:spacing w:before="40" w:after="40"/>
-            </w:pPr>
-            <w:r>
-              <w:rPr>
-                <w:b/>
-              </w:rPr>
-            </w:r>
-            <w:r>
-              <w:rPr>
-                <w:rFonts w:ascii="Calibri" w:hAnsi="Calibri"/>
-                <w:b/>
-                <w:sz w:val="20"/>
-              </w:rPr>
-              <w:t>China</w:t>
-            </w:r>
-          </w:p>
-        </w:tc>
-        <w:tc>
-          <w:tcPr>
-            <w:tcW w:type="dxa" w:w="1152"/>
-          </w:tcPr>
-          <w:p>
-            <w:pPr>
-              <w:spacing w:before="40" w:after="40"/>
-            </w:pPr>
-            <w:r/>
-            <w:r>
-              <w:rPr>
-                <w:rFonts w:ascii="Calibri" w:hAnsi="Calibri"/>
-                <w:sz w:val="20"/>
-              </w:rPr>
-              <w:t>20</w:t>
-            </w:r>
-          </w:p>
-        </w:tc>
-        <w:tc>
-          <w:tcPr>
-            <w:tcW w:type="dxa" w:w="2160"/>
-          </w:tcPr>
-          <w:p>
-            <w:pPr>
-              <w:spacing w:before="40" w:after="40"/>
-            </w:pPr>
-            <w:r/>
-            <w:r>
-              <w:rPr>
-                <w:rFonts w:ascii="Calibri" w:hAnsi="Calibri"/>
-                <w:sz w:val="20"/>
-              </w:rPr>
-              <w:t>collectivist</w:t>
-            </w:r>
-          </w:p>
-        </w:tc>
-      </w:tr>
-      <w:tr>
-        <w:tc>
-          <w:tcPr>
-            <w:tcW w:type="dxa" w:w="2880"/>
-            <w:shd w:fill="F2F7FB"/>
-          </w:tcPr>
-          <w:p>
-            <w:pPr>
-              <w:spacing w:before="40" w:after="40"/>
-            </w:pPr>
-            <w:r>
-              <w:rPr>
-                <w:b/>
-              </w:rPr>
-            </w:r>
-            <w:r>
-              <w:rPr>
-                <w:rFonts w:ascii="Calibri" w:hAnsi="Calibri"/>
-                <w:b/>
-                <w:sz w:val="20"/>
-              </w:rPr>
-              <w:t>Thailand</w:t>
-            </w:r>
-          </w:p>
-        </w:tc>
-        <w:tc>
-          <w:tcPr>
-            <w:tcW w:type="dxa" w:w="1152"/>
-            <w:shd w:fill="F2F7FB"/>
-          </w:tcPr>
-          <w:p>
-            <w:pPr>
-              <w:spacing w:before="40" w:after="40"/>
-            </w:pPr>
-            <w:r/>
-            <w:r>
-              <w:rPr>
-                <w:rFonts w:ascii="Calibri" w:hAnsi="Calibri"/>
-                <w:sz w:val="20"/>
-              </w:rPr>
-              <w:t>20</w:t>
-            </w:r>
-          </w:p>
-        </w:tc>
-        <w:tc>
-          <w:tcPr>
-            <w:tcW w:type="dxa" w:w="2160"/>
-            <w:shd w:fill="F2F7FB"/>
-          </w:tcPr>
-          <w:p>
-            <w:pPr>
-              <w:spacing w:before="40" w:after="40"/>
-            </w:pPr>
-            <w:r/>
-            <w:r>
-              <w:rPr>
-                <w:rFonts w:ascii="Calibri" w:hAnsi="Calibri"/>
-                <w:sz w:val="20"/>
-              </w:rPr>
-              <w:t>collectivist</w:t>
-            </w:r>
-          </w:p>
-        </w:tc>
-      </w:tr>
-      <w:tr>
-        <w:tc>
-          <w:tcPr>
-            <w:tcW w:type="dxa" w:w="2880"/>
-          </w:tcPr>
-          <w:p>
-            <w:pPr>
-              <w:spacing w:before="40" w:after="40"/>
-            </w:pPr>
-            <w:r>
-              <w:rPr>
-                <w:b/>
-              </w:rPr>
-            </w:r>
-            <w:r>
-              <w:rPr>
-                <w:rFonts w:ascii="Calibri" w:hAnsi="Calibri"/>
-                <w:b/>
-                <w:sz w:val="20"/>
-              </w:rPr>
-              <w:t>Vietnam</w:t>
-            </w:r>
-          </w:p>
-        </w:tc>
-        <w:tc>
-          <w:tcPr>
-            <w:tcW w:type="dxa" w:w="1152"/>
-          </w:tcPr>
-          <w:p>
-            <w:pPr>
-              <w:spacing w:before="40" w:after="40"/>
-            </w:pPr>
-            <w:r/>
-            <w:r>
-              <w:rPr>
-                <w:rFonts w:ascii="Calibri" w:hAnsi="Calibri"/>
-                <w:sz w:val="20"/>
-              </w:rPr>
-              <w:t>20</w:t>
-            </w:r>
-          </w:p>
-        </w:tc>
-        <w:tc>
-          <w:tcPr>
-            <w:tcW w:type="dxa" w:w="2160"/>
-          </w:tcPr>
-          <w:p>
-            <w:pPr>
-              <w:spacing w:before="40" w:after="40"/>
-            </w:pPr>
-            <w:r/>
-            <w:r>
-              <w:rPr>
-                <w:rFonts w:ascii="Calibri" w:hAnsi="Calibri"/>
-                <w:sz w:val="20"/>
-              </w:rPr>
-              <w:t>collectivist</w:t>
-            </w:r>
-          </w:p>
-        </w:tc>
-      </w:tr>
-      <w:tr>
-        <w:tc>
-          <w:tcPr>
-            <w:tcW w:type="dxa" w:w="2880"/>
-            <w:shd w:fill="F2F7FB"/>
-          </w:tcPr>
-          <w:p>
-            <w:pPr>
-              <w:spacing w:before="40" w:after="40"/>
-            </w:pPr>
-            <w:r>
-              <w:rPr>
-                <w:b/>
-              </w:rPr>
-            </w:r>
-            <w:r>
-              <w:rPr>
-                <w:rFonts w:ascii="Calibri" w:hAnsi="Calibri"/>
-                <w:b/>
-                <w:sz w:val="20"/>
-              </w:rPr>
-              <w:t>South Korea</w:t>
-            </w:r>
-          </w:p>
-        </w:tc>
-        <w:tc>
-          <w:tcPr>
-            <w:tcW w:type="dxa" w:w="1152"/>
-            <w:shd w:fill="F2F7FB"/>
-          </w:tcPr>
-          <w:p>
-            <w:pPr>
-              <w:spacing w:before="40" w:after="40"/>
-            </w:pPr>
-            <w:r/>
-            <w:r>
-              <w:rPr>
-                <w:rFonts w:ascii="Calibri" w:hAnsi="Calibri"/>
-                <w:sz w:val="20"/>
-              </w:rPr>
-              <w:t>18</w:t>
-            </w:r>
-          </w:p>
-        </w:tc>
-        <w:tc>
-          <w:tcPr>
-            <w:tcW w:type="dxa" w:w="2160"/>
-            <w:shd w:fill="F2F7FB"/>
-          </w:tcPr>
-          <w:p>
-            <w:pPr>
-              <w:spacing w:before="40" w:after="40"/>
-            </w:pPr>
-            <w:r/>
-            <w:r>
-              <w:rPr>
-                <w:rFonts w:ascii="Calibri" w:hAnsi="Calibri"/>
-                <w:sz w:val="20"/>
-              </w:rPr>
-              <w:t>collectivist</w:t>
-            </w:r>
-          </w:p>
-        </w:tc>
-      </w:tr>
-      <w:tr>
-        <w:tc>
-          <w:tcPr>
-            <w:tcW w:type="dxa" w:w="2880"/>
-          </w:tcPr>
-          <w:p>
-            <w:pPr>
-              <w:spacing w:before="40" w:after="40"/>
-            </w:pPr>
-            <w:r>
-              <w:rPr>
-                <w:b/>
-              </w:rPr>
-            </w:r>
-            <w:r>
-              <w:rPr>
-                <w:rFonts w:ascii="Calibri" w:hAnsi="Calibri"/>
-                <w:b/>
-                <w:sz w:val="20"/>
-              </w:rPr>
-              <w:t>Taiwan</w:t>
-            </w:r>
-          </w:p>
-        </w:tc>
-        <w:tc>
-          <w:tcPr>
-            <w:tcW w:type="dxa" w:w="1152"/>
-          </w:tcPr>
-          <w:p>
-            <w:pPr>
-              <w:spacing w:before="40" w:after="40"/>
-            </w:pPr>
-            <w:r/>
-            <w:r>
-              <w:rPr>
-                <w:rFonts w:ascii="Calibri" w:hAnsi="Calibri"/>
-                <w:sz w:val="20"/>
-              </w:rPr>
-              <w:t>17</w:t>
-            </w:r>
-          </w:p>
-        </w:tc>
-        <w:tc>
-          <w:tcPr>
-            <w:tcW w:type="dxa" w:w="2160"/>
-          </w:tcPr>
-          <w:p>
-            <w:pPr>
-              <w:spacing w:before="40" w:after="40"/>
-            </w:pPr>
-            <w:r/>
-            <w:r>
-              <w:rPr>
-                <w:rFonts w:ascii="Calibri" w:hAnsi="Calibri"/>
-                <w:sz w:val="20"/>
-              </w:rPr>
-              <w:t>collectivist</w:t>
-            </w:r>
-          </w:p>
-        </w:tc>
-      </w:tr>
-      <w:tr>
-        <w:tc>
-          <w:tcPr>
-            <w:tcW w:type="dxa" w:w="2880"/>
-            <w:shd w:fill="F2F7FB"/>
-          </w:tcPr>
-          <w:p>
-            <w:pPr>
-              <w:spacing w:before="40" w:after="40"/>
-            </w:pPr>
-            <w:r>
-              <w:rPr>
-                <w:b/>
-              </w:rPr>
-            </w:r>
-            <w:r>
-              <w:rPr>
-                <w:rFonts w:ascii="Calibri" w:hAnsi="Calibri"/>
-                <w:b/>
-                <w:sz w:val="20"/>
-              </w:rPr>
-              <w:t>Indonesia</w:t>
-            </w:r>
-          </w:p>
-        </w:tc>
-        <w:tc>
-          <w:tcPr>
-            <w:tcW w:type="dxa" w:w="1152"/>
-            <w:shd w:fill="F2F7FB"/>
-          </w:tcPr>
-          <w:p>
-            <w:pPr>
-              <w:spacing w:before="40" w:after="40"/>
-            </w:pPr>
-            <w:r/>
-            <w:r>
-              <w:rPr>
-                <w:rFonts w:ascii="Calibri" w:hAnsi="Calibri"/>
-                <w:sz w:val="20"/>
-              </w:rPr>
-              <w:t>14</w:t>
-            </w:r>
-          </w:p>
-        </w:tc>
-        <w:tc>
-          <w:tcPr>
-            <w:tcW w:type="dxa" w:w="2160"/>
-            <w:shd w:fill="F2F7FB"/>
-          </w:tcPr>
-          <w:p>
-            <w:pPr>
-              <w:spacing w:before="40" w:after="40"/>
-            </w:pPr>
-            <w:r/>
-            <w:r>
-              <w:rPr>
-                <w:rFonts w:ascii="Calibri" w:hAnsi="Calibri"/>
-                <w:sz w:val="20"/>
-              </w:rPr>
-              <w:t>collectivist</w:t>
-            </w:r>
-          </w:p>
-        </w:tc>
-      </w:tr>
-      <w:tr>
-        <w:tc>
-          <w:tcPr>
-            <w:tcW w:type="dxa" w:w="2880"/>
-          </w:tcPr>
-          <w:p>
-            <w:pPr>
-              <w:spacing w:before="40" w:after="40"/>
-            </w:pPr>
-            <w:r>
-              <w:rPr>
-                <w:b/>
-              </w:rPr>
-            </w:r>
-            <w:r>
-              <w:rPr>
-                <w:rFonts w:ascii="Calibri" w:hAnsi="Calibri"/>
-                <w:b/>
-                <w:sz w:val="20"/>
-              </w:rPr>
-              <w:t>Pakistan</w:t>
-            </w:r>
-          </w:p>
-        </w:tc>
-        <w:tc>
-          <w:tcPr>
-            <w:tcW w:type="dxa" w:w="1152"/>
-          </w:tcPr>
-          <w:p>
-            <w:pPr>
-              <w:spacing w:before="40" w:after="40"/>
-            </w:pPr>
-            <w:r/>
-            <w:r>
-              <w:rPr>
-                <w:rFonts w:ascii="Calibri" w:hAnsi="Calibri"/>
-                <w:sz w:val="20"/>
-              </w:rPr>
-              <w:t>14</w:t>
-            </w:r>
-          </w:p>
-        </w:tc>
-        <w:tc>
-          <w:tcPr>
-            <w:tcW w:type="dxa" w:w="2160"/>
-          </w:tcPr>
-          <w:p>
-            <w:pPr>
-              <w:spacing w:before="40" w:after="40"/>
-            </w:pPr>
-            <w:r/>
-            <w:r>
-              <w:rPr>
-                <w:rFonts w:ascii="Calibri" w:hAnsi="Calibri"/>
-                <w:sz w:val="20"/>
-              </w:rPr>
-              <w:t>collectivist</w:t>
-            </w:r>
-          </w:p>
-        </w:tc>
-      </w:tr>
-    </w:tbl>
-    <w:p/>
-    <w:p>
-      <w:r>
-        <w:rPr>
-          <w:rFonts w:ascii="Calibri" w:hAnsi="Calibri"/>
-          <w:sz w:val="22"/>
-        </w:rPr>
-        <w:t>If a country is not listed, check Hofstede Insights for the IDV score. If unavailable, flag in DISCREPANCY_LOG and leave as NA.</w:t>
-      </w:r>
-    </w:p>
     <w:p>
       <w:pPr>
         <w:pStyle w:val="Heading3"/>
@@ -9542,8 +7655,8 @@
       <w:r>
         <w:t>6. Correlation Matrix Coding Instructions</w:t>
       </w:r>
-      <w:bookmarkStart w:id="6181" w:name="ch6"/>
-      <w:bookmarkEnd w:id="6181"/>
+      <w:bookmarkStart w:id="1007" w:name="ch6"/>
+      <w:bookmarkEnd w:id="1007"/>
     </w:p>
     <w:tbl>
       <w:tblPr>
@@ -11482,8 +9595,8 @@
       <w:r>
         <w:t>7. Construct Harmonization Instructions</w:t>
       </w:r>
-      <w:bookmarkStart w:id="8173" w:name="ch7"/>
-      <w:bookmarkEnd w:id="8173"/>
+      <w:bookmarkStart w:id="3463" w:name="ch7"/>
+      <w:bookmarkEnd w:id="3463"/>
     </w:p>
     <w:p>
       <w:r>
@@ -15959,8 +14072,8 @@
       <w:r>
         <w:t>8. Moderator Variable Coding</w:t>
       </w:r>
-      <w:bookmarkStart w:id="4036" w:name="ch8"/>
-      <w:bookmarkEnd w:id="4036"/>
+      <w:bookmarkStart w:id="7021" w:name="ch8"/>
+      <w:bookmarkEnd w:id="7021"/>
     </w:p>
     <w:p>
       <w:pPr>
@@ -16937,8 +15050,8 @@
       <w:r>
         <w:t>9. Reliability Data Extraction</w:t>
       </w:r>
-      <w:bookmarkStart w:id="3188" w:name="ch9"/>
-      <w:bookmarkEnd w:id="3188"/>
+      <w:bookmarkStart w:id="1179" w:name="ch9"/>
+      <w:bookmarkEnd w:id="1179"/>
     </w:p>
     <w:p>
       <w:pPr>
@@ -17871,8 +15984,8 @@
       <w:r>
         <w:t>10. AI-Assisted Coding Protocol</w:t>
       </w:r>
-      <w:bookmarkStart w:id="6692" w:name="ch10"/>
-      <w:bookmarkEnd w:id="6692"/>
+      <w:bookmarkStart w:id="5261" w:name="ch10"/>
+      <w:bookmarkEnd w:id="5261"/>
     </w:p>
     <w:p>
       <w:pPr>
@@ -19082,8 +17195,8 @@
       <w:r>
         <w:t>11. Inter-Coder Reliability Protocol</w:t>
       </w:r>
-      <w:bookmarkStart w:id="8653" w:name="ch11"/>
-      <w:bookmarkEnd w:id="8653"/>
+      <w:bookmarkStart w:id="6533" w:name="ch11"/>
+      <w:bookmarkEnd w:id="6533"/>
     </w:p>
     <w:p>
       <w:pPr>
@@ -20442,8 +18555,8 @@
       <w:r>
         <w:t>12. Discrepancy Resolution Protocol</w:t>
       </w:r>
-      <w:bookmarkStart w:id="4487" w:name="ch12"/>
-      <w:bookmarkEnd w:id="4487"/>
+      <w:bookmarkStart w:id="5323" w:name="ch12"/>
+      <w:bookmarkEnd w:id="5323"/>
     </w:p>
     <w:p>
       <w:pPr>
@@ -21083,8 +19196,8 @@
       <w:r>
         <w:t>13. Study Exclusion Protocol</w:t>
       </w:r>
-      <w:bookmarkStart w:id="292" w:name="ch13"/>
-      <w:bookmarkEnd w:id="292"/>
+      <w:bookmarkStart w:id="5425" w:name="ch13"/>
+      <w:bookmarkEnd w:id="5425"/>
     </w:p>
     <w:p>
       <w:pPr>
@@ -21899,8 +20012,8 @@
       <w:r>
         <w:t>14. Quality Assurance Checklist</w:t>
       </w:r>
-      <w:bookmarkStart w:id="2369" w:name="ch14"/>
-      <w:bookmarkEnd w:id="2369"/>
+      <w:bookmarkStart w:id="9818" w:name="ch14"/>
+      <w:bookmarkEnd w:id="9818"/>
     </w:p>
     <w:tbl>
       <w:tblPr>
@@ -22402,8 +20515,8 @@
       <w:r>
         <w:t>15. References</w:t>
       </w:r>
-      <w:bookmarkStart w:id="7064" w:name="ch15"/>
-      <w:bookmarkEnd w:id="7064"/>
+      <w:bookmarkStart w:id="405" w:name="ch15"/>
+      <w:bookmarkEnd w:id="405"/>
     </w:p>
     <w:p>
       <w:pPr>
@@ -22549,8 +20662,8 @@
       <w:r>
         <w:t>Appendix A: Decision Trees</w:t>
       </w:r>
-      <w:bookmarkStart w:id="9868" w:name="appA"/>
-      <w:bookmarkEnd w:id="9868"/>
+      <w:bookmarkStart w:id="4596" w:name="appA"/>
+      <w:bookmarkEnd w:id="4596"/>
     </w:p>
     <w:p>
       <w:pPr>
@@ -23056,8 +21169,8 @@
       <w:r>
         <w:t>Appendix B: FAQ</w:t>
       </w:r>
-      <w:bookmarkStart w:id="4541" w:name="appB"/>
-      <w:bookmarkEnd w:id="4541"/>
+      <w:bookmarkStart w:id="4051" w:name="appB"/>
+      <w:bookmarkEnd w:id="4051"/>
     </w:p>
     <w:p>
       <w:r>
@@ -23260,8 +21373,8 @@
       <w:r>
         <w:t>Appendix C: Excel Template Sheet Descriptions</w:t>
       </w:r>
-      <w:bookmarkStart w:id="253" w:name="appC"/>
-      <w:bookmarkEnd w:id="253"/>
+      <w:bookmarkStart w:id="9078" w:name="appC"/>
+      <w:bookmarkEnd w:id="9078"/>
     </w:p>
     <w:tbl>
       <w:tblPr>

</xml_diff>